<commit_message>
fix: loan contract 8月起算; 12/31尾款282,051
</commit_message>
<xml_diff>
--- a/loan_contract_300k_b.docx
+++ b/loan_contract_300k_b.docx
@@ -108,7 +108,7 @@
           <w:b w:val="0"/>
           <w:sz w:val="24"/>
         </w:rPr>
-        <w:t>二、借貸期限：自民國 115 年 7 月 ____ 日起，至民國 115 年 12 月 31 日止。</w:t>
+        <w:t>二、借貸期限：自民國 115 年 7 月 ____ 日起，至民國 115 年 12 月 31 日止。實際還款自民國 115 年 8 月起算。</w:t>
       </w:r>
     </w:p>
     <w:p>
@@ -354,7 +354,7 @@
                 <w:b w:val="0"/>
                 <w:sz w:val="22"/>
               </w:rPr>
-              <w:t>民國 7 月</w:t>
+              <w:t>民國 8 月</w:t>
             </w:r>
           </w:p>
         </w:tc>
@@ -464,7 +464,7 @@
                 <w:b w:val="0"/>
                 <w:sz w:val="22"/>
               </w:rPr>
-              <w:t>民國 8 月</w:t>
+              <w:t>民國 9 月</w:t>
             </w:r>
           </w:p>
         </w:tc>
@@ -574,7 +574,7 @@
                 <w:b w:val="0"/>
                 <w:sz w:val="22"/>
               </w:rPr>
-              <w:t>民國 9 月</w:t>
+              <w:t>民國 10 月</w:t>
             </w:r>
           </w:p>
         </w:tc>
@@ -684,7 +684,7 @@
                 <w:b w:val="0"/>
                 <w:sz w:val="22"/>
               </w:rPr>
-              <w:t>民國 10 月</w:t>
+              <w:t>民國 11 月</w:t>
             </w:r>
           </w:p>
         </w:tc>
@@ -794,7 +794,7 @@
                 <w:b w:val="0"/>
                 <w:sz w:val="22"/>
               </w:rPr>
-              <w:t>民國 11 月</w:t>
+              <w:t>民國 12 月</w:t>
             </w:r>
           </w:p>
         </w:tc>
@@ -812,7 +812,7 @@
                 <w:b w:val="0"/>
                 <w:sz w:val="22"/>
               </w:rPr>
-              <w:t>6,000</w:t>
+              <w:t>282,051</w:t>
             </w:r>
           </w:p>
         </w:tc>
@@ -830,7 +830,7 @@
                 <w:b w:val="0"/>
                 <w:sz w:val="22"/>
               </w:rPr>
-              <w:t>4,830</w:t>
+              <w:t>280,881</w:t>
             </w:r>
           </w:p>
         </w:tc>
@@ -849,116 +849,6 @@
                 <w:sz w:val="22"/>
               </w:rPr>
               <w:t>1,170</w:t>
-            </w:r>
-          </w:p>
-        </w:tc>
-        <w:tc>
-          <w:tcPr>
-            <w:tcW w:type="dxa" w:w="1553"/>
-          </w:tcPr>
-          <w:p>
-            <w:pPr>
-              <w:jc w:val="center"/>
-            </w:pPr>
-            <w:r>
-              <w:rPr>
-                <w:rFonts w:ascii="標楷體" w:hAnsi="標楷體" w:eastAsia="標楷體"/>
-                <w:b w:val="0"/>
-                <w:sz w:val="22"/>
-              </w:rPr>
-              <w:t>276,051</w:t>
-            </w:r>
-          </w:p>
-        </w:tc>
-        <w:tc>
-          <w:tcPr>
-            <w:tcW w:type="dxa" w:w="1553"/>
-          </w:tcPr>
-          <w:p>
-            <w:pPr>
-              <w:jc w:val="center"/>
-            </w:pPr>
-            <w:r>
-              <w:rPr>
-                <w:rFonts w:ascii="標楷體" w:hAnsi="標楷體" w:eastAsia="標楷體"/>
-                <w:b w:val="0"/>
-                <w:sz w:val="22"/>
-              </w:rPr>
-              <w:t>按月繳</w:t>
-            </w:r>
-          </w:p>
-        </w:tc>
-      </w:tr>
-      <w:tr>
-        <w:tc>
-          <w:tcPr>
-            <w:tcW w:type="dxa" w:w="1553"/>
-          </w:tcPr>
-          <w:p>
-            <w:pPr>
-              <w:jc w:val="center"/>
-            </w:pPr>
-            <w:r>
-              <w:rPr>
-                <w:rFonts w:ascii="標楷體" w:hAnsi="標楷體" w:eastAsia="標楷體"/>
-                <w:b w:val="0"/>
-                <w:sz w:val="22"/>
-              </w:rPr>
-              <w:t>民國 12 月</w:t>
-            </w:r>
-          </w:p>
-        </w:tc>
-        <w:tc>
-          <w:tcPr>
-            <w:tcW w:type="dxa" w:w="1553"/>
-          </w:tcPr>
-          <w:p>
-            <w:pPr>
-              <w:jc w:val="center"/>
-            </w:pPr>
-            <w:r>
-              <w:rPr>
-                <w:rFonts w:ascii="標楷體" w:hAnsi="標楷體" w:eastAsia="標楷體"/>
-                <w:b w:val="0"/>
-                <w:sz w:val="22"/>
-              </w:rPr>
-              <w:t>277,201</w:t>
-            </w:r>
-          </w:p>
-        </w:tc>
-        <w:tc>
-          <w:tcPr>
-            <w:tcW w:type="dxa" w:w="1553"/>
-          </w:tcPr>
-          <w:p>
-            <w:pPr>
-              <w:jc w:val="center"/>
-            </w:pPr>
-            <w:r>
-              <w:rPr>
-                <w:rFonts w:ascii="標楷體" w:hAnsi="標楷體" w:eastAsia="標楷體"/>
-                <w:b w:val="0"/>
-                <w:sz w:val="22"/>
-              </w:rPr>
-              <w:t>276,051</w:t>
-            </w:r>
-          </w:p>
-        </w:tc>
-        <w:tc>
-          <w:tcPr>
-            <w:tcW w:type="dxa" w:w="1553"/>
-          </w:tcPr>
-          <w:p>
-            <w:pPr>
-              <w:jc w:val="center"/>
-            </w:pPr>
-            <w:r>
-              <w:rPr>
-                <w:rFonts w:ascii="標楷體" w:hAnsi="標楷體" w:eastAsia="標楷體"/>
-                <w:b w:val="0"/>
-                <w:sz w:val="22"/>
-              </w:rPr>
-              <w:t>1,150</w:t>
             </w:r>
           </w:p>
         </w:tc>
@@ -1009,7 +899,7 @@
           <w:color w:val="C00000"/>
           <w:sz w:val="24"/>
         </w:rPr>
-        <w:t>★ 12 月 31 日到期需一筆清償尾款：277,201 元（本金 276,051 + 利息 1,150）</w:t>
+        <w:t>★ 12 月 31 日到期需一筆清償尾款：282,051 元（本金 280,890 + 利息 1,161）</w:t>
       </w:r>
     </w:p>
     <w:p/>

</xml_diff>

<commit_message>
feat: integrate buffett_cto_analyzer into daily_deploy pipeline (step 2.8)
</commit_message>
<xml_diff>
--- a/loan_contract_300k_b.docx
+++ b/loan_contract_300k_b.docx
@@ -36,7 +36,7 @@
           <w:b w:val="0"/>
           <w:sz w:val="24"/>
         </w:rPr>
-        <w:t>貸與人（以下簡稱甲方）：__________________________</w:t>
+        <w:t>貸與人（以下簡稱甲方）：梁世賓</w:t>
       </w:r>
     </w:p>
     <w:p>
@@ -46,17 +46,7 @@
           <w:b w:val="0"/>
           <w:sz w:val="24"/>
         </w:rPr>
-        <w:t>借款人（以下簡稱乙方）：__________________________</w:t>
-      </w:r>
-    </w:p>
-    <w:p>
-      <w:r>
-        <w:rPr>
-          <w:rFonts w:ascii="標楷體" w:hAnsi="標楷體" w:eastAsia="標楷體"/>
-          <w:b w:val="0"/>
-          <w:sz w:val="24"/>
-        </w:rPr>
-        <w:t>連帶保證人（以下簡稱丙方）：__________________________</w:t>
+        <w:t>借款人（以下簡稱乙方）：陳宛琳</w:t>
       </w:r>
     </w:p>
     <w:p/>
@@ -67,7 +57,7 @@
           <w:b w:val="0"/>
           <w:sz w:val="24"/>
         </w:rPr>
-        <w:t>茲因乙方因業務週轉需要，向甲方借款，經雙方充分協議，同意條款如下，以資共同遵守：</w:t>
+        <w:t>茲因乙方因個人資金週轉需要，向甲方借款，經雙方充分協議，同意條款如下，以資共同遵守：</w:t>
       </w:r>
     </w:p>
     <w:p/>
@@ -108,7 +98,7 @@
           <w:b w:val="0"/>
           <w:sz w:val="24"/>
         </w:rPr>
-        <w:t>二、借貸期限：自民國 115 年 7 月 ____ 日起，至民國 115 年 12 月 31 日止。實際還款自民國 115 年 8 月起算。</w:t>
+        <w:t>二、借貸期限：自民國 115 年 8 月 1 日起，至民國 115 年 12 月 31 日止。</w:t>
       </w:r>
     </w:p>
     <w:p>
@@ -121,7 +111,7 @@
           <w:b w:val="0"/>
           <w:sz w:val="24"/>
         </w:rPr>
-        <w:t>三、交付方式：甲方於本契約簽署後，將全額借款匯入乙方指定帳戶（合作金庫銀行東沙鹿分行，戶名：洛禾思健康發展有限公司）。匯款完成即視為交付完畢。</w:t>
+        <w:t>三、交付方式：甲方於契約簽署完成後，將借款匯入乙方指定帳戶。匯款完成即視為交付完畢。</w:t>
       </w:r>
     </w:p>
     <w:p/>
@@ -136,7 +126,7 @@
           <w:color w:val="1A478A"/>
           <w:sz w:val="24"/>
         </w:rPr>
-        <w:t>■ 第二條：還款方式與利息計算（方案B）</w:t>
+        <w:t>■ 第二條：還款方式與利息計算</w:t>
       </w:r>
     </w:p>
     <w:p>
@@ -149,7 +139,7 @@
           <w:b w:val="0"/>
           <w:sz w:val="24"/>
         </w:rPr>
-        <w:t>一、利率：雙方約定本借款之年利率為 5%，利息按每月實際天數計算。</w:t>
+        <w:t>一、利息計算：雙方約定本借款之年利率為 5%，月利率為 5% ÷ 12，約 0.4167%。</w:t>
       </w:r>
     </w:p>
     <w:p>
@@ -162,7 +152,7 @@
           <w:b w:val="0"/>
           <w:sz w:val="24"/>
         </w:rPr>
-        <w:t>二、每月還款：於借貸期限內，乙方每月償還新台幣 6,000 元，首期還款優先抵充利息，餘額抵充本金。每月還款日為每月 ____ 日。</w:t>
+        <w:t>二、按月還款：借款期間內，乙方承諾自民國 115 年 8 月起，於每月 5 日前固定償還新台幣 陸仟元整（NT$ 6,000）予甲方（即 8/5、9/5、10/5、11/5、12/5 共五期）。前開款項應優先沖抵利息，剩餘部分沖抵借款本金。</w:t>
       </w:r>
     </w:p>
     <w:p>
@@ -175,7 +165,7 @@
           <w:b w:val="0"/>
           <w:sz w:val="24"/>
         </w:rPr>
-        <w:t>三、到期清償：乙方應於民國 115 年 12 月 31 日前，將剩餘未還本金及至該日為止之應計利息一次全額清償。</w:t>
+        <w:t>三、到期清償（年底尾款）：本契約於民國 115 年 12 月 31 日到期，乙方承諾應於當日將未償還之賸餘全額本金新台幣 276,050 元整及最後一期應付利息，共計匯付新台幣 277,032 元整予甲方，一次全額清償結清。</w:t>
       </w:r>
     </w:p>
     <w:p>
@@ -188,7 +178,7 @@
           <w:b w:val="0"/>
           <w:sz w:val="24"/>
         </w:rPr>
-        <w:t>四、還款帳號：</w:t>
+        <w:t>四、甲方指定收款帳戶：</w:t>
       </w:r>
     </w:p>
     <w:p>
@@ -201,7 +191,33 @@
           <w:b w:val="0"/>
           <w:sz w:val="24"/>
         </w:rPr>
-        <w:t>銀行：________　　分行：________　　帳號：________</w:t>
+        <w:t>銀行：________　　分行：________</w:t>
+      </w:r>
+    </w:p>
+    <w:p>
+      <w:pPr>
+        <w:ind w:left="720"/>
+      </w:pPr>
+      <w:r>
+        <w:rPr>
+          <w:rFonts w:ascii="標楷體" w:hAnsi="標楷體" w:eastAsia="標楷體"/>
+          <w:b w:val="0"/>
+          <w:sz w:val="24"/>
+        </w:rPr>
+        <w:t>戶名：________</w:t>
+      </w:r>
+    </w:p>
+    <w:p>
+      <w:pPr>
+        <w:ind w:left="720"/>
+      </w:pPr>
+      <w:r>
+        <w:rPr>
+          <w:rFonts w:ascii="標楷體" w:hAnsi="標楷體" w:eastAsia="標楷體"/>
+          <w:b w:val="0"/>
+          <w:sz w:val="24"/>
+        </w:rPr>
+        <w:t>帳號：________</w:t>
       </w:r>
     </w:p>
     <w:p/>
@@ -212,7 +228,7 @@
           <w:b/>
           <w:sz w:val="24"/>
         </w:rPr>
-        <w:t>五、還款明細表（預計）</w:t>
+        <w:t>五、還款明細表（基準：8月5日開扣）</w:t>
       </w:r>
     </w:p>
     <w:tbl>
@@ -244,7 +260,7 @@
                 <w:b/>
                 <w:sz w:val="22"/>
               </w:rPr>
-              <w:t>月份</w:t>
+              <w:t>期數</w:t>
             </w:r>
           </w:p>
         </w:tc>
@@ -262,7 +278,7 @@
                 <w:b/>
                 <w:sz w:val="22"/>
               </w:rPr>
-              <w:t>每月繳款</w:t>
+              <w:t>還款日期</w:t>
             </w:r>
           </w:p>
         </w:tc>
@@ -280,7 +296,7 @@
                 <w:b/>
                 <w:sz w:val="22"/>
               </w:rPr>
-              <w:t>本金</w:t>
+              <w:t>應付總額 (元)</w:t>
             </w:r>
           </w:p>
         </w:tc>
@@ -298,7 +314,7 @@
                 <w:b/>
                 <w:sz w:val="22"/>
               </w:rPr>
-              <w:t>利息</w:t>
+              <w:t>當期利息 (5%÷12)</w:t>
             </w:r>
           </w:p>
         </w:tc>
@@ -316,7 +332,7 @@
                 <w:b/>
                 <w:sz w:val="22"/>
               </w:rPr>
-              <w:t>剩餘本金</w:t>
+              <w:t>沖抵本金 (元)</w:t>
             </w:r>
           </w:p>
         </w:tc>
@@ -334,7 +350,7 @@
                 <w:b/>
                 <w:sz w:val="22"/>
               </w:rPr>
-              <w:t>備註</w:t>
+              <w:t>償還後剩餘本金 (元)</w:t>
             </w:r>
           </w:p>
         </w:tc>
@@ -354,7 +370,25 @@
                 <w:b w:val="0"/>
                 <w:sz w:val="22"/>
               </w:rPr>
-              <w:t>民國 8 月</w:t>
+              <w:t>第 1 期</w:t>
+            </w:r>
+          </w:p>
+        </w:tc>
+        <w:tc>
+          <w:tcPr>
+            <w:tcW w:type="dxa" w:w="1553"/>
+          </w:tcPr>
+          <w:p>
+            <w:pPr>
+              <w:jc w:val="center"/>
+            </w:pPr>
+            <w:r>
+              <w:rPr>
+                <w:rFonts w:ascii="標楷體" w:hAnsi="標楷體" w:eastAsia="標楷體"/>
+                <w:b w:val="0"/>
+                <w:sz w:val="22"/>
+              </w:rPr>
+              <w:t>115 年 8 月 5 日</w:t>
             </w:r>
           </w:p>
         </w:tc>
@@ -390,7 +424,7 @@
                 <w:b w:val="0"/>
                 <w:sz w:val="22"/>
               </w:rPr>
-              <w:t>4,750</w:t>
+              <w:t>1,250</w:t>
             </w:r>
           </w:p>
         </w:tc>
@@ -408,7 +442,7 @@
                 <w:b w:val="0"/>
                 <w:sz w:val="22"/>
               </w:rPr>
-              <w:t>1,250</w:t>
+              <w:t>4,750</w:t>
             </w:r>
           </w:p>
         </w:tc>
@@ -430,24 +464,6 @@
             </w:r>
           </w:p>
         </w:tc>
-        <w:tc>
-          <w:tcPr>
-            <w:tcW w:type="dxa" w:w="1553"/>
-          </w:tcPr>
-          <w:p>
-            <w:pPr>
-              <w:jc w:val="center"/>
-            </w:pPr>
-            <w:r>
-              <w:rPr>
-                <w:rFonts w:ascii="標楷體" w:hAnsi="標楷體" w:eastAsia="標楷體"/>
-                <w:b w:val="0"/>
-                <w:sz w:val="22"/>
-              </w:rPr>
-              <w:t>按月繳</w:t>
-            </w:r>
-          </w:p>
-        </w:tc>
       </w:tr>
       <w:tr>
         <w:tc>
@@ -464,7 +480,25 @@
                 <w:b w:val="0"/>
                 <w:sz w:val="22"/>
               </w:rPr>
-              <w:t>民國 9 月</w:t>
+              <w:t>第 2 期</w:t>
+            </w:r>
+          </w:p>
+        </w:tc>
+        <w:tc>
+          <w:tcPr>
+            <w:tcW w:type="dxa" w:w="1553"/>
+          </w:tcPr>
+          <w:p>
+            <w:pPr>
+              <w:jc w:val="center"/>
+            </w:pPr>
+            <w:r>
+              <w:rPr>
+                <w:rFonts w:ascii="標楷體" w:hAnsi="標楷體" w:eastAsia="標楷體"/>
+                <w:b w:val="0"/>
+                <w:sz w:val="22"/>
+              </w:rPr>
+              <w:t>115 年 9 月 5 日</w:t>
             </w:r>
           </w:p>
         </w:tc>
@@ -500,7 +534,7 @@
                 <w:b w:val="0"/>
                 <w:sz w:val="22"/>
               </w:rPr>
-              <w:t>4,770</w:t>
+              <w:t>1,230</w:t>
             </w:r>
           </w:p>
         </w:tc>
@@ -518,7 +552,7 @@
                 <w:b w:val="0"/>
                 <w:sz w:val="22"/>
               </w:rPr>
-              <w:t>1,230</w:t>
+              <w:t>4,770</w:t>
             </w:r>
           </w:p>
         </w:tc>
@@ -540,24 +574,6 @@
             </w:r>
           </w:p>
         </w:tc>
-        <w:tc>
-          <w:tcPr>
-            <w:tcW w:type="dxa" w:w="1553"/>
-          </w:tcPr>
-          <w:p>
-            <w:pPr>
-              <w:jc w:val="center"/>
-            </w:pPr>
-            <w:r>
-              <w:rPr>
-                <w:rFonts w:ascii="標楷體" w:hAnsi="標楷體" w:eastAsia="標楷體"/>
-                <w:b w:val="0"/>
-                <w:sz w:val="22"/>
-              </w:rPr>
-              <w:t>按月繳</w:t>
-            </w:r>
-          </w:p>
-        </w:tc>
       </w:tr>
       <w:tr>
         <w:tc>
@@ -574,7 +590,25 @@
                 <w:b w:val="0"/>
                 <w:sz w:val="22"/>
               </w:rPr>
-              <w:t>民國 10 月</w:t>
+              <w:t>第 3 期</w:t>
+            </w:r>
+          </w:p>
+        </w:tc>
+        <w:tc>
+          <w:tcPr>
+            <w:tcW w:type="dxa" w:w="1553"/>
+          </w:tcPr>
+          <w:p>
+            <w:pPr>
+              <w:jc w:val="center"/>
+            </w:pPr>
+            <w:r>
+              <w:rPr>
+                <w:rFonts w:ascii="標楷體" w:hAnsi="標楷體" w:eastAsia="標楷體"/>
+                <w:b w:val="0"/>
+                <w:sz w:val="22"/>
+              </w:rPr>
+              <w:t>115 年 10 月 5 日</w:t>
             </w:r>
           </w:p>
         </w:tc>
@@ -610,6 +644,24 @@
                 <w:b w:val="0"/>
                 <w:sz w:val="22"/>
               </w:rPr>
+              <w:t>1,210</w:t>
+            </w:r>
+          </w:p>
+        </w:tc>
+        <w:tc>
+          <w:tcPr>
+            <w:tcW w:type="dxa" w:w="1553"/>
+          </w:tcPr>
+          <w:p>
+            <w:pPr>
+              <w:jc w:val="center"/>
+            </w:pPr>
+            <w:r>
+              <w:rPr>
+                <w:rFonts w:ascii="標楷體" w:hAnsi="標楷體" w:eastAsia="標楷體"/>
+                <w:b w:val="0"/>
+                <w:sz w:val="22"/>
+              </w:rPr>
               <w:t>4,790</w:t>
             </w:r>
           </w:p>
@@ -628,43 +680,7 @@
                 <w:b w:val="0"/>
                 <w:sz w:val="22"/>
               </w:rPr>
-              <w:t>1,210</w:t>
-            </w:r>
-          </w:p>
-        </w:tc>
-        <w:tc>
-          <w:tcPr>
-            <w:tcW w:type="dxa" w:w="1553"/>
-          </w:tcPr>
-          <w:p>
-            <w:pPr>
-              <w:jc w:val="center"/>
-            </w:pPr>
-            <w:r>
-              <w:rPr>
-                <w:rFonts w:ascii="標楷體" w:hAnsi="標楷體" w:eastAsia="標楷體"/>
-                <w:b w:val="0"/>
-                <w:sz w:val="22"/>
-              </w:rPr>
-              <w:t>285,691</w:t>
-            </w:r>
-          </w:p>
-        </w:tc>
-        <w:tc>
-          <w:tcPr>
-            <w:tcW w:type="dxa" w:w="1553"/>
-          </w:tcPr>
-          <w:p>
-            <w:pPr>
-              <w:jc w:val="center"/>
-            </w:pPr>
-            <w:r>
-              <w:rPr>
-                <w:rFonts w:ascii="標楷體" w:hAnsi="標楷體" w:eastAsia="標楷體"/>
-                <w:b w:val="0"/>
-                <w:sz w:val="22"/>
-              </w:rPr>
-              <w:t>按月繳</w:t>
+              <w:t>285,690</w:t>
             </w:r>
           </w:p>
         </w:tc>
@@ -684,7 +700,25 @@
                 <w:b w:val="0"/>
                 <w:sz w:val="22"/>
               </w:rPr>
-              <w:t>民國 11 月</w:t>
+              <w:t>第 4 期</w:t>
+            </w:r>
+          </w:p>
+        </w:tc>
+        <w:tc>
+          <w:tcPr>
+            <w:tcW w:type="dxa" w:w="1553"/>
+          </w:tcPr>
+          <w:p>
+            <w:pPr>
+              <w:jc w:val="center"/>
+            </w:pPr>
+            <w:r>
+              <w:rPr>
+                <w:rFonts w:ascii="標楷體" w:hAnsi="標楷體" w:eastAsia="標楷體"/>
+                <w:b w:val="0"/>
+                <w:sz w:val="22"/>
+              </w:rPr>
+              <w:t>115 年 11 月 5 日</w:t>
             </w:r>
           </w:p>
         </w:tc>
@@ -720,6 +754,24 @@
                 <w:b w:val="0"/>
                 <w:sz w:val="22"/>
               </w:rPr>
+              <w:t>1,190</w:t>
+            </w:r>
+          </w:p>
+        </w:tc>
+        <w:tc>
+          <w:tcPr>
+            <w:tcW w:type="dxa" w:w="1553"/>
+          </w:tcPr>
+          <w:p>
+            <w:pPr>
+              <w:jc w:val="center"/>
+            </w:pPr>
+            <w:r>
+              <w:rPr>
+                <w:rFonts w:ascii="標楷體" w:hAnsi="標楷體" w:eastAsia="標楷體"/>
+                <w:b w:val="0"/>
+                <w:sz w:val="22"/>
+              </w:rPr>
               <w:t>4,810</w:t>
             </w:r>
           </w:p>
@@ -738,43 +790,7 @@
                 <w:b w:val="0"/>
                 <w:sz w:val="22"/>
               </w:rPr>
-              <w:t>1,190</w:t>
-            </w:r>
-          </w:p>
-        </w:tc>
-        <w:tc>
-          <w:tcPr>
-            <w:tcW w:type="dxa" w:w="1553"/>
-          </w:tcPr>
-          <w:p>
-            <w:pPr>
-              <w:jc w:val="center"/>
-            </w:pPr>
-            <w:r>
-              <w:rPr>
-                <w:rFonts w:ascii="標楷體" w:hAnsi="標楷體" w:eastAsia="標楷體"/>
-                <w:b w:val="0"/>
-                <w:sz w:val="22"/>
-              </w:rPr>
-              <w:t>280,881</w:t>
-            </w:r>
-          </w:p>
-        </w:tc>
-        <w:tc>
-          <w:tcPr>
-            <w:tcW w:type="dxa" w:w="1553"/>
-          </w:tcPr>
-          <w:p>
-            <w:pPr>
-              <w:jc w:val="center"/>
-            </w:pPr>
-            <w:r>
-              <w:rPr>
-                <w:rFonts w:ascii="標楷體" w:hAnsi="標楷體" w:eastAsia="標楷體"/>
-                <w:b w:val="0"/>
-                <w:sz w:val="22"/>
-              </w:rPr>
-              <w:t>按月繳</w:t>
+              <w:t>280,880</w:t>
             </w:r>
           </w:p>
         </w:tc>
@@ -794,7 +810,7 @@
                 <w:b w:val="0"/>
                 <w:sz w:val="22"/>
               </w:rPr>
-              <w:t>民國 12 月</w:t>
+              <w:t>第 5 期</w:t>
             </w:r>
           </w:p>
         </w:tc>
@@ -812,7 +828,7 @@
                 <w:b w:val="0"/>
                 <w:sz w:val="22"/>
               </w:rPr>
-              <w:t>282,051</w:t>
+              <w:t>115 年 12 月 5 日</w:t>
             </w:r>
           </w:p>
         </w:tc>
@@ -830,7 +846,7 @@
                 <w:b w:val="0"/>
                 <w:sz w:val="22"/>
               </w:rPr>
-              <w:t>280,881</w:t>
+              <w:t>6,000</w:t>
             </w:r>
           </w:p>
         </w:tc>
@@ -866,7 +882,7 @@
                 <w:b w:val="0"/>
                 <w:sz w:val="22"/>
               </w:rPr>
-              <w:t>0</w:t>
+              <w:t>4,830</w:t>
             </w:r>
           </w:p>
         </w:tc>
@@ -884,7 +900,117 @@
                 <w:b w:val="0"/>
                 <w:sz w:val="22"/>
               </w:rPr>
-              <w:t>到期一筆清</w:t>
+              <w:t>276,050</w:t>
+            </w:r>
+          </w:p>
+        </w:tc>
+      </w:tr>
+      <w:tr>
+        <w:tc>
+          <w:tcPr>
+            <w:tcW w:type="dxa" w:w="1553"/>
+          </w:tcPr>
+          <w:p>
+            <w:pPr>
+              <w:jc w:val="center"/>
+            </w:pPr>
+            <w:r>
+              <w:rPr>
+                <w:rFonts w:ascii="標楷體" w:hAnsi="標楷體" w:eastAsia="標楷體"/>
+                <w:b/>
+                <w:sz w:val="22"/>
+              </w:rPr>
+              <w:t>第 6 期</w:t>
+            </w:r>
+          </w:p>
+        </w:tc>
+        <w:tc>
+          <w:tcPr>
+            <w:tcW w:type="dxa" w:w="1553"/>
+          </w:tcPr>
+          <w:p>
+            <w:pPr>
+              <w:jc w:val="center"/>
+            </w:pPr>
+            <w:r>
+              <w:rPr>
+                <w:rFonts w:ascii="標楷體" w:hAnsi="標楷體" w:eastAsia="標楷體"/>
+                <w:b w:val="0"/>
+                <w:sz w:val="22"/>
+              </w:rPr>
+              <w:t>115 年 12 月 31 日 (到期結清)</w:t>
+            </w:r>
+          </w:p>
+        </w:tc>
+        <w:tc>
+          <w:tcPr>
+            <w:tcW w:type="dxa" w:w="1553"/>
+          </w:tcPr>
+          <w:p>
+            <w:pPr>
+              <w:jc w:val="center"/>
+            </w:pPr>
+            <w:r>
+              <w:rPr>
+                <w:rFonts w:ascii="標楷體" w:hAnsi="標楷體" w:eastAsia="標楷體"/>
+                <w:b w:val="0"/>
+                <w:sz w:val="22"/>
+              </w:rPr>
+              <w:t>277,032</w:t>
+            </w:r>
+          </w:p>
+        </w:tc>
+        <w:tc>
+          <w:tcPr>
+            <w:tcW w:type="dxa" w:w="1553"/>
+          </w:tcPr>
+          <w:p>
+            <w:pPr>
+              <w:jc w:val="center"/>
+            </w:pPr>
+            <w:r>
+              <w:rPr>
+                <w:rFonts w:ascii="標楷體" w:hAnsi="標楷體" w:eastAsia="標楷體"/>
+                <w:b w:val="0"/>
+                <w:sz w:val="22"/>
+              </w:rPr>
+              <w:t>982</w:t>
+            </w:r>
+          </w:p>
+        </w:tc>
+        <w:tc>
+          <w:tcPr>
+            <w:tcW w:type="dxa" w:w="1553"/>
+          </w:tcPr>
+          <w:p>
+            <w:pPr>
+              <w:jc w:val="center"/>
+            </w:pPr>
+            <w:r>
+              <w:rPr>
+                <w:rFonts w:ascii="標楷體" w:hAnsi="標楷體" w:eastAsia="標楷體"/>
+                <w:b w:val="0"/>
+                <w:sz w:val="22"/>
+              </w:rPr>
+              <w:t>276,050</w:t>
+            </w:r>
+          </w:p>
+        </w:tc>
+        <w:tc>
+          <w:tcPr>
+            <w:tcW w:type="dxa" w:w="1553"/>
+          </w:tcPr>
+          <w:p>
+            <w:pPr>
+              <w:jc w:val="center"/>
+            </w:pPr>
+            <w:r>
+              <w:rPr>
+                <w:rFonts w:ascii="標楷體" w:hAnsi="標楷體" w:eastAsia="標楷體"/>
+                <w:b w:val="0"/>
+                <w:sz w:val="22"/>
+              </w:rPr>
+              <w:t>0 (結清)</w:t>
             </w:r>
           </w:p>
         </w:tc>
@@ -899,7 +1025,7 @@
           <w:color w:val="C00000"/>
           <w:sz w:val="24"/>
         </w:rPr>
-        <w:t>★ 12 月 31 日到期需一筆清償尾款：282,051 元（本金 280,890 + 利息 1,161）</w:t>
+        <w:t>★ 12 月 31 日到期需一筆清償尾款：277,032 元（本金 276,050 + 利息 982）</w:t>
       </w:r>
     </w:p>
     <w:p/>
@@ -927,7 +1053,7 @@
           <w:b w:val="0"/>
           <w:sz w:val="24"/>
         </w:rPr>
-        <w:t>一、為擔保乙方對甲方之本票債務，乙方及丙方應於簽約時共同簽發本票乙紙，交付甲方收執。</w:t>
+        <w:t>一、為擔保本筆借款本息之按期清償，乙方同意於簽署本契約之同時，簽發本票乙紙，交付甲方收執。</w:t>
       </w:r>
     </w:p>
     <w:p>
@@ -940,59 +1066,7 @@
           <w:b w:val="0"/>
           <w:sz w:val="24"/>
         </w:rPr>
-        <w:t>二、本票記載如下：</w:t>
-      </w:r>
-    </w:p>
-    <w:p>
-      <w:pPr>
-        <w:ind w:left="720"/>
-      </w:pPr>
-      <w:r>
-        <w:rPr>
-          <w:rFonts w:ascii="標楷體" w:hAnsi="標楷體" w:eastAsia="標楷體"/>
-          <w:b w:val="0"/>
-          <w:sz w:val="24"/>
-        </w:rPr>
-        <w:t>票面金額：新台幣 300,000 元整</w:t>
-      </w:r>
-    </w:p>
-    <w:p>
-      <w:pPr>
-        <w:ind w:left="720"/>
-      </w:pPr>
-      <w:r>
-        <w:rPr>
-          <w:rFonts w:ascii="標楷體" w:hAnsi="標楷體" w:eastAsia="標楷體"/>
-          <w:b w:val="0"/>
-          <w:sz w:val="24"/>
-        </w:rPr>
-        <w:t>發票人：洛禾思健康發展有限公司（蓋公司大小章）、陳宛琳（簽名蓋章）</w:t>
-      </w:r>
-    </w:p>
-    <w:p>
-      <w:pPr>
-        <w:ind w:left="720"/>
-      </w:pPr>
-      <w:r>
-        <w:rPr>
-          <w:rFonts w:ascii="標楷體" w:hAnsi="標楷體" w:eastAsia="標楷體"/>
-          <w:b w:val="0"/>
-          <w:sz w:val="24"/>
-        </w:rPr>
-        <w:t>付款地：甲方指定址所</w:t>
-      </w:r>
-    </w:p>
-    <w:p>
-      <w:pPr>
-        <w:ind w:left="720"/>
-      </w:pPr>
-      <w:r>
-        <w:rPr>
-          <w:rFonts w:ascii="標楷體" w:hAnsi="標楷體" w:eastAsia="標楷體"/>
-          <w:b w:val="0"/>
-          <w:sz w:val="24"/>
-        </w:rPr>
-        <w:t>到期日：民國 115 年 12 月 31 日</w:t>
+        <w:t>二、本票記載：面額新台幣 300,000 元整，到期日民國 115 年 12 月 31 日。</w:t>
       </w:r>
     </w:p>
     <w:p>
@@ -1005,7 +1079,7 @@
           <w:b w:val="0"/>
           <w:sz w:val="24"/>
         </w:rPr>
-        <w:t>三、乙方及丙方如依約清償，甲方應無條件返還本票正本；如有違約，甲方得提示本票並依法請求付款。</w:t>
+        <w:t>三、乙方如依約按期並於到期日全額清償本息完畢，甲方應於清償當日無條件返還本票正本。</w:t>
       </w:r>
     </w:p>
     <w:p>
@@ -1037,7 +1111,7 @@
           <w:b w:val="0"/>
           <w:sz w:val="24"/>
         </w:rPr>
-        <w:t>一、失權效果（加速條款）：乙方如有任何一期未按時償還，即喪失期限利益，甲方得逕行主張全部債務即時到期，乙方及丙方應於甲方通知日起 5 日內一次清償全部剩餘本金、利息及一切費用。</w:t>
+        <w:t>一、期限利益喪失（加速條款）：乙方如有一期未按時償還，或到期未一次清償剩餘本息，即視為全部到期。甲方得直接依法持本契約及上述擔保本票，向法院聲請本票裁定強制執行，扣押、拍賣乙方名下之財產。</w:t>
       </w:r>
     </w:p>
     <w:p>
@@ -1050,20 +1124,7 @@
           <w:b w:val="0"/>
           <w:sz w:val="24"/>
         </w:rPr>
-        <w:t>二、票據行使：乙方或丙方如有違約，甲方得隨時提示本票，並依法向法院聲請強制執行、拍賣或扣押乙方及丙方之一切財產，乙方及丙方絕無異議。</w:t>
-      </w:r>
-    </w:p>
-    <w:p>
-      <w:pPr>
-        <w:pStyle w:val="ListNumber"/>
-      </w:pPr>
-      <w:r>
-        <w:rPr>
-          <w:rFonts w:ascii="標楷體" w:hAnsi="標楷體" w:eastAsia="標楷體"/>
-          <w:b w:val="0"/>
-          <w:sz w:val="24"/>
-        </w:rPr>
-        <w:t>三、逾期罰則：乙方逾期償還時，除仍按原約定利率計息外，並應按逾期未還金額之萬分之五，自逾期翌日起至清償日止計付違約金。</w:t>
+        <w:t>二、違約金：逾期未還期間，除原定利息外，乙方應自逾期之日起，按未償金額每日加計萬分之五之違約金直至完全清償日止。</w:t>
       </w:r>
     </w:p>
     <w:p/>
@@ -1078,48 +1139,7 @@
           <w:color w:val="1A478A"/>
           <w:sz w:val="24"/>
         </w:rPr>
-        <w:t>■ 第五條：連帶保證責任</w:t>
-      </w:r>
-    </w:p>
-    <w:p>
-      <w:pPr>
-        <w:pStyle w:val="ListNumber"/>
-      </w:pPr>
-      <w:r>
-        <w:rPr>
-          <w:rFonts w:ascii="標楷體" w:hAnsi="標楷體" w:eastAsia="標楷體"/>
-          <w:b w:val="0"/>
-          <w:sz w:val="24"/>
-        </w:rPr>
-        <w:t>一、丙方就乙方對甲方所負之本票債務（包括本金、利息、違約金、損害賠償及甲方因追償所生之律師費、訴訟費、執行費等）負連帶清償責任。</w:t>
-      </w:r>
-    </w:p>
-    <w:p>
-      <w:pPr>
-        <w:pStyle w:val="ListNumber"/>
-      </w:pPr>
-      <w:r>
-        <w:rPr>
-          <w:rFonts w:ascii="標楷體" w:hAnsi="標楷體" w:eastAsia="標楷體"/>
-          <w:b w:val="0"/>
-          <w:sz w:val="24"/>
-        </w:rPr>
-        <w:t>二、甲方得分別或同時向丙方請求清償，無須先就乙方財產強制執行或選定執行順序；丙方亦不得主張先訴抗辯權。</w:t>
-      </w:r>
-    </w:p>
-    <w:p/>
-    <w:p>
-      <w:pPr>
-        <w:spacing w:before="160" w:after="80"/>
-      </w:pPr>
-      <w:r>
-        <w:rPr>
-          <w:rFonts w:ascii="標楷體" w:hAnsi="標楷體" w:eastAsia="標楷體"/>
-          <w:b/>
-          <w:color w:val="1A478A"/>
-          <w:sz w:val="24"/>
-        </w:rPr>
-        <w:t>■ 第六條：管轄法院</w:t>
+        <w:t>■ 第五條：管轄法院</w:t>
       </w:r>
     </w:p>
     <w:p>
@@ -1129,67 +1149,7 @@
           <w:b w:val="0"/>
           <w:sz w:val="24"/>
         </w:rPr>
-        <w:t>一、因本契約涉訟時，甲乙雙方合意以臺灣 ______ 地方法院為第一審管轄法院。</w:t>
-      </w:r>
-    </w:p>
-    <w:p/>
-    <w:p>
-      <w:pPr>
-        <w:spacing w:before="160" w:after="160"/>
-      </w:pPr>
-      <w:r>
-        <w:rPr>
-          <w:rFonts w:ascii="標楷體" w:hAnsi="標楷體" w:eastAsia="標楷體"/>
-          <w:b/>
-          <w:color w:val="8A5A00"/>
-          <w:sz w:val="24"/>
-        </w:rPr>
-        <w:t>█ 甲方簽約特別提醒</w:t>
-      </w:r>
-    </w:p>
-    <w:p>
-      <w:pPr>
-        <w:spacing w:after="60"/>
-        <w:ind w:left="432"/>
-      </w:pPr>
-      <w:r>
-        <w:rPr>
-          <w:rFonts w:ascii="標楷體" w:hAnsi="標楷體" w:eastAsia="標楷體"/>
-          <w:b w:val="0"/>
-          <w:color w:val="666666"/>
-          <w:sz w:val="22"/>
-        </w:rPr>
-        <w:t>1. 乙方簽約時，必須由「洛禾思健康發展有限公司」親蓋公司大小章，負責人陳宛琳親自簽名並蓋章。</w:t>
-      </w:r>
-    </w:p>
-    <w:p>
-      <w:pPr>
-        <w:spacing w:after="60"/>
-        <w:ind w:left="432"/>
-      </w:pPr>
-      <w:r>
-        <w:rPr>
-          <w:rFonts w:ascii="標楷體" w:hAnsi="標楷體" w:eastAsia="標楷體"/>
-          <w:b w:val="0"/>
-          <w:color w:val="666666"/>
-          <w:sz w:val="22"/>
-        </w:rPr>
-        <w:t>2. 丙方陳宛琳須親自簽名蓋章，並填寫身分證字號，以確保其個人負連帶清償責任。</w:t>
-      </w:r>
-    </w:p>
-    <w:p>
-      <w:pPr>
-        <w:spacing w:after="60"/>
-        <w:ind w:left="432"/>
-      </w:pPr>
-      <w:r>
-        <w:rPr>
-          <w:rFonts w:ascii="標楷體" w:hAnsi="標楷體" w:eastAsia="標楷體"/>
-          <w:b w:val="0"/>
-          <w:color w:val="666666"/>
-          <w:sz w:val="22"/>
-        </w:rPr>
-        <w:t>3. 本票發票人欄位需由「洛禾思健康發展有限公司」（大小章）與「陳宛琳」（簽名）共同簽發，確保本票債權對公司及個人均有效。</w:t>
+        <w:t>一、因本契約涉訟時，雙方同意以臺灣 ______ 地方法院為第一審管轄法院。</w:t>
       </w:r>
     </w:p>
     <w:p/>
@@ -1204,7 +1164,7 @@
           <w:color w:val="999999"/>
           <w:sz w:val="20"/>
         </w:rPr>
-        <w:t>第 2 頁，共 3 頁</w:t>
+        <w:t>第 2 頁，共 2 頁</w:t>
       </w:r>
     </w:p>
     <w:p>
@@ -1219,7 +1179,7 @@
           <w:b/>
           <w:sz w:val="24"/>
         </w:rPr>
-        <w:t>甲方（貸與人）：</w:t>
+        <w:t>甲方（貸與人）：梁世賓</w:t>
       </w:r>
     </w:p>
     <w:p>
@@ -1229,7 +1189,7 @@
           <w:b w:val="0"/>
           <w:sz w:val="24"/>
         </w:rPr>
-        <w:t>姓名：____________</w:t>
+        <w:t>身分證字號：B121674155</w:t>
       </w:r>
     </w:p>
     <w:p>
@@ -1239,17 +1199,7 @@
           <w:b w:val="0"/>
           <w:sz w:val="24"/>
         </w:rPr>
-        <w:t>身分證字號：____________</w:t>
-      </w:r>
-    </w:p>
-    <w:p>
-      <w:r>
-        <w:rPr>
-          <w:rFonts w:ascii="標楷體" w:hAnsi="標楷體" w:eastAsia="標楷體"/>
-          <w:b w:val="0"/>
-          <w:sz w:val="24"/>
-        </w:rPr>
-        <w:t>地址：____________</w:t>
+        <w:t>地址：台中市北屯區四平路568巷5號18樓B6</w:t>
       </w:r>
     </w:p>
     <w:p>
@@ -1270,7 +1220,7 @@
           <w:color w:val="888888"/>
           <w:sz w:val="22"/>
         </w:rPr>
-        <w:t>（簽名蓋章）</w:t>
+        <w:t>（簽名）</w:t>
       </w:r>
     </w:p>
     <w:p>
@@ -1294,82 +1244,7 @@
           <w:b/>
           <w:sz w:val="24"/>
         </w:rPr>
-        <w:t>乙方（借款人）：</w:t>
-      </w:r>
-    </w:p>
-    <w:p>
-      <w:r>
-        <w:rPr>
-          <w:rFonts w:ascii="標楷體" w:hAnsi="標楷體" w:eastAsia="標楷體"/>
-          <w:b w:val="0"/>
-          <w:sz w:val="24"/>
-        </w:rPr>
-        <w:t>公司名稱：洛禾思健康發展有限公司</w:t>
-      </w:r>
-    </w:p>
-    <w:p>
-      <w:r>
-        <w:rPr>
-          <w:rFonts w:ascii="標楷體" w:hAnsi="標楷體" w:eastAsia="標楷體"/>
-          <w:b w:val="0"/>
-          <w:sz w:val="24"/>
-        </w:rPr>
-        <w:t>統一編號：____________</w:t>
-      </w:r>
-    </w:p>
-    <w:p>
-      <w:r>
-        <w:rPr>
-          <w:rFonts w:ascii="標楷體" w:hAnsi="標楷體" w:eastAsia="標楷體"/>
-          <w:b w:val="0"/>
-          <w:sz w:val="24"/>
-        </w:rPr>
-        <w:t>地址：____________</w:t>
-      </w:r>
-    </w:p>
-    <w:p>
-      <w:r>
-        <w:rPr>
-          <w:rFonts w:ascii="標楷體" w:hAnsi="標楷體" w:eastAsia="標楷體"/>
-          <w:b w:val="0"/>
-          <w:sz w:val="24"/>
-        </w:rPr>
-        <w:t>負責人：陳宛琳</w:t>
-      </w:r>
-    </w:p>
-    <w:p>
-      <w:r>
-        <w:rPr>
-          <w:rFonts w:ascii="標楷體" w:hAnsi="標楷體" w:eastAsia="標楷體"/>
-          <w:b w:val="0"/>
-          <w:color w:val="888888"/>
-          <w:sz w:val="22"/>
-        </w:rPr>
-        <w:t>（公司大章與負責人小章）</w:t>
-      </w:r>
-    </w:p>
-    <w:p>
-      <w:pPr>
-        <w:spacing w:before="240" w:after="240"/>
-      </w:pPr>
-      <w:r>
-        <w:rPr>
-          <w:rFonts w:ascii="標楷體" w:hAnsi="標楷體" w:eastAsia="標楷體"/>
-          <w:b w:val="0"/>
-          <w:color w:val="CCCCCC"/>
-          <w:sz w:val="20"/>
-        </w:rPr>
-        <w:t>────────────────────────────────────────────</w:t>
-      </w:r>
-    </w:p>
-    <w:p>
-      <w:r>
-        <w:rPr>
-          <w:rFonts w:ascii="標楷體" w:hAnsi="標楷體" w:eastAsia="標楷體"/>
-          <w:b/>
-          <w:sz w:val="24"/>
-        </w:rPr>
-        <w:t>丙方（連帶保證人）：</w:t>
+        <w:t>乙方（借款人）：___________________________</w:t>
       </w:r>
     </w:p>
     <w:p>
@@ -1420,7 +1295,7 @@
           <w:color w:val="888888"/>
           <w:sz w:val="22"/>
         </w:rPr>
-        <w:t>（本人親自簽名蓋章）</w:t>
+        <w:t>（簽名）</w:t>
       </w:r>
     </w:p>
     <w:p/>

</xml_diff>